<commit_message>
Correct ORDER-SQ-020 spec values from clearer source captures
Co-Authored-By: Claude Opus 5.5 <noreply@anthropic.com>
Claude-Session: https://claude.ai/code/session_01FE1iHhKDB28jMp1ccrGyNw
</commit_message>
<xml_diff>
--- a/docs/api-spec/ORDER-SQ-020_취소대상상품조회.docx
+++ b/docs/api-spec/ORDER-SQ-020_취소대상상품조회.docx
@@ -831,25 +831,7 @@
           <w:sz w:val="17"/>
           <w:szCs w:val="17"/>
         </w:rPr>
-        <w:t xml:space="preserve">  "orderNumber": "</w:t>
-      </w:r>
-      <w:r>
-        <w:rPr>
-          <w:rFonts w:ascii="Consolas" w:cs="Consolas" w:eastAsia="Consolas" w:hAnsi="Consolas"/>
-          <w:sz w:val="17"/>
-          <w:szCs w:val="17"/>
-          <w:highlight w:val="yellow"/>
-          <w:highlightCs w:val="yellow"/>
-        </w:rPr>
-        <w:t xml:space="preserve">Y2604294632244</w:t>
-      </w:r>
-      <w:r>
-        <w:rPr>
-          <w:rFonts w:ascii="Consolas" w:cs="Consolas" w:eastAsia="Consolas" w:hAnsi="Consolas"/>
-          <w:sz w:val="17"/>
-          <w:szCs w:val="17"/>
-        </w:rPr>
-        <w:t xml:space="preserve">"</w:t>
+        <w:t xml:space="preserve">  "orderNumber": "Y2604294632244"</w:t>
       </w:r>
     </w:p>
     <w:p>
@@ -6213,29 +6195,7 @@
                 <w:sz w:val="18"/>
                 <w:szCs w:val="18"/>
               </w:rPr>
-              <w:t xml:space="preserve">선물주문 상품 </w:t>
-            </w:r>
-            <w:r>
-              <w:rPr>
-                <w:rFonts w:ascii="맑은 고딕" w:cs="맑은 고딕" w:eastAsia="맑은 고딕" w:hAnsi="맑은 고딕"/>
-                <w:b w:val="false"/>
-                <w:bCs w:val="false"/>
-                <w:sz w:val="18"/>
-                <w:szCs w:val="18"/>
-                <w:highlight w:val="yellow"/>
-                <w:highlightCs w:val="yellow"/>
-              </w:rPr>
-              <w:t xml:space="preserve">수정전</w:t>
-            </w:r>
-            <w:r>
-              <w:rPr>
-                <w:rFonts w:ascii="맑은 고딕" w:cs="맑은 고딕" w:eastAsia="맑은 고딕" w:hAnsi="맑은 고딕"/>
-                <w:b w:val="false"/>
-                <w:bCs w:val="false"/>
-                <w:sz w:val="18"/>
-                <w:szCs w:val="18"/>
-              </w:rPr>
-              <w:t xml:space="preserve"> / 오늘드림 주문 / CJ 카드 할인 적용 시 true</w:t>
+              <w:t xml:space="preserve">선물주문 선물 수락전 / 오늘드림 주문 / CJ 카드 할인 적용 시 true</w:t>
             </w:r>
           </w:p>
         </w:tc>
@@ -6518,25 +6478,7 @@
           <w:sz w:val="17"/>
           <w:szCs w:val="17"/>
         </w:rPr>
-        <w:t xml:space="preserve">        "deliveryNumber": "</w:t>
-      </w:r>
-      <w:r>
-        <w:rPr>
-          <w:rFonts w:ascii="Consolas" w:cs="Consolas" w:eastAsia="Consolas" w:hAnsi="Consolas"/>
-          <w:sz w:val="17"/>
-          <w:szCs w:val="17"/>
-          <w:highlight w:val="yellow"/>
-          <w:highlightCs w:val="yellow"/>
-        </w:rPr>
-        <w:t xml:space="preserve">2604111932390116888</w:t>
-      </w:r>
-      <w:r>
-        <w:rPr>
-          <w:rFonts w:ascii="Consolas" w:cs="Consolas" w:eastAsia="Consolas" w:hAnsi="Consolas"/>
-          <w:sz w:val="17"/>
-          <w:szCs w:val="17"/>
-        </w:rPr>
-        <w:t xml:space="preserve">",</w:t>
+        <w:t xml:space="preserve">        "deliveryNumber": "2606111932390118898",</w:t>
       </w:r>
     </w:p>
     <w:p>
@@ -6581,58 +6523,22 @@
           <w:sz w:val="17"/>
           <w:szCs w:val="17"/>
         </w:rPr>
-        <w:t xml:space="preserve">        "goodsNumber": "</w:t>
-      </w:r>
-      <w:r>
-        <w:rPr>
-          <w:rFonts w:ascii="Consolas" w:cs="Consolas" w:eastAsia="Consolas" w:hAnsi="Consolas"/>
-          <w:sz w:val="17"/>
-          <w:szCs w:val="17"/>
-          <w:highlight w:val="yellow"/>
-          <w:highlightCs w:val="yellow"/>
-        </w:rPr>
-        <w:t xml:space="preserve">A000000189658</w:t>
-      </w:r>
-      <w:r>
-        <w:rPr>
-          <w:rFonts w:ascii="Consolas" w:cs="Consolas" w:eastAsia="Consolas" w:hAnsi="Consolas"/>
-          <w:sz w:val="17"/>
-          <w:szCs w:val="17"/>
-        </w:rPr>
-        <w:t xml:space="preserve">",</w:t>
-      </w:r>
-    </w:p>
-    <w:p>
-      <w:pPr>
-        <w:shd w:fill="F3F3F3" w:color="auto" w:val="clear"/>
-        <w:spacing w:after="0" w:before="0" w:line="260"/>
-        <w:ind w:left="120" w:right="120"/>
-      </w:pPr>
-      <w:r>
-        <w:rPr>
-          <w:rFonts w:ascii="Consolas" w:cs="Consolas" w:eastAsia="Consolas" w:hAnsi="Consolas"/>
-          <w:sz w:val="17"/>
-          <w:szCs w:val="17"/>
-        </w:rPr>
-        <w:t xml:space="preserve">        "goodsName": "</w:t>
-      </w:r>
-      <w:r>
-        <w:rPr>
-          <w:rFonts w:ascii="Consolas" w:cs="Consolas" w:eastAsia="Consolas" w:hAnsi="Consolas"/>
-          <w:sz w:val="17"/>
-          <w:szCs w:val="17"/>
-          <w:highlight w:val="yellow"/>
-          <w:highlightCs w:val="yellow"/>
-        </w:rPr>
-        <w:t xml:space="preserve">[원본 이미지 해상도로 판독 불가 – 원본 확인 필요] … 5.5g-…</w:t>
-      </w:r>
-      <w:r>
-        <w:rPr>
-          <w:rFonts w:ascii="Consolas" w:cs="Consolas" w:eastAsia="Consolas" w:hAnsi="Consolas"/>
-          <w:sz w:val="17"/>
-          <w:szCs w:val="17"/>
-        </w:rPr>
-        <w:t xml:space="preserve">",</w:t>
+        <w:t xml:space="preserve">        "goodsNumber": "A000000109650",</w:t>
+      </w:r>
+    </w:p>
+    <w:p>
+      <w:pPr>
+        <w:shd w:fill="F3F3F3" w:color="auto" w:val="clear"/>
+        <w:spacing w:after="0" w:before="0" w:line="260"/>
+        <w:ind w:left="120" w:right="120"/>
+      </w:pPr>
+      <w:r>
+        <w:rPr>
+          <w:rFonts w:ascii="Consolas" w:cs="Consolas" w:eastAsia="Consolas" w:hAnsi="Consolas"/>
+          <w:sz w:val="17"/>
+          <w:szCs w:val="17"/>
+        </w:rPr>
+        <w:t xml:space="preserve">        "goodsName": "[예약테스트]3CE 무드레시피 페이스 블러쉬 5.5g-상품스퀘드",</w:t>
       </w:r>
     </w:p>
     <w:p>
@@ -6662,58 +6568,22 @@
           <w:sz w:val="17"/>
           <w:szCs w:val="17"/>
         </w:rPr>
-        <w:t xml:space="preserve">        "optionName": "</w:t>
-      </w:r>
-      <w:r>
-        <w:rPr>
-          <w:rFonts w:ascii="Consolas" w:cs="Consolas" w:eastAsia="Consolas" w:hAnsi="Consolas"/>
-          <w:sz w:val="17"/>
-          <w:szCs w:val="17"/>
-          <w:highlight w:val="yellow"/>
-          <w:highlightCs w:val="yellow"/>
-        </w:rPr>
-        <w:t xml:space="preserve">21Y(체리)PEACH001</w:t>
-      </w:r>
-      <w:r>
-        <w:rPr>
-          <w:rFonts w:ascii="Consolas" w:cs="Consolas" w:eastAsia="Consolas" w:hAnsi="Consolas"/>
-          <w:sz w:val="17"/>
-          <w:szCs w:val="17"/>
-        </w:rPr>
-        <w:t xml:space="preserve">",</w:t>
-      </w:r>
-    </w:p>
-    <w:p>
-      <w:pPr>
-        <w:shd w:fill="F3F3F3" w:color="auto" w:val="clear"/>
-        <w:spacing w:after="0" w:before="0" w:line="260"/>
-        <w:ind w:left="120" w:right="120"/>
-      </w:pPr>
-      <w:r>
-        <w:rPr>
-          <w:rFonts w:ascii="Consolas" w:cs="Consolas" w:eastAsia="Consolas" w:hAnsi="Consolas"/>
-          <w:sz w:val="17"/>
-          <w:szCs w:val="17"/>
-        </w:rPr>
-        <w:t xml:space="preserve">        "orderProgressStateCode": "</w:t>
-      </w:r>
-      <w:r>
-        <w:rPr>
-          <w:rFonts w:ascii="Consolas" w:cs="Consolas" w:eastAsia="Consolas" w:hAnsi="Consolas"/>
-          <w:sz w:val="17"/>
-          <w:szCs w:val="17"/>
-          <w:highlight w:val="yellow"/>
-          <w:highlightCs w:val="yellow"/>
-        </w:rPr>
-        <w:t xml:space="preserve">40</w:t>
-      </w:r>
-      <w:r>
-        <w:rPr>
-          <w:rFonts w:ascii="Consolas" w:cs="Consolas" w:eastAsia="Consolas" w:hAnsi="Consolas"/>
-          <w:sz w:val="17"/>
-          <w:szCs w:val="17"/>
-        </w:rPr>
-        <w:t xml:space="preserve">",</w:t>
+        <w:t xml:space="preserve">        "optionName": "2(Y)NUDEPEACH001",</w:t>
+      </w:r>
+    </w:p>
+    <w:p>
+      <w:pPr>
+        <w:shd w:fill="F3F3F3" w:color="auto" w:val="clear"/>
+        <w:spacing w:after="0" w:before="0" w:line="260"/>
+        <w:ind w:left="120" w:right="120"/>
+      </w:pPr>
+      <w:r>
+        <w:rPr>
+          <w:rFonts w:ascii="Consolas" w:cs="Consolas" w:eastAsia="Consolas" w:hAnsi="Consolas"/>
+          <w:sz w:val="17"/>
+          <w:szCs w:val="17"/>
+        </w:rPr>
+        <w:t xml:space="preserve">        "orderProgressStateCode": "40",</w:t>
       </w:r>
     </w:p>
     <w:p>
@@ -6818,25 +6688,7 @@
           <w:sz w:val="17"/>
           <w:szCs w:val="17"/>
         </w:rPr>
-        <w:t xml:space="preserve">        "orderGoodsSectionName": "</w:t>
-      </w:r>
-      <w:r>
-        <w:rPr>
-          <w:rFonts w:ascii="Consolas" w:cs="Consolas" w:eastAsia="Consolas" w:hAnsi="Consolas"/>
-          <w:sz w:val="17"/>
-          <w:szCs w:val="17"/>
-          <w:highlight w:val="yellow"/>
-          <w:highlightCs w:val="yellow"/>
-        </w:rPr>
-        <w:t xml:space="preserve">일반상품</w:t>
-      </w:r>
-      <w:r>
-        <w:rPr>
-          <w:rFonts w:ascii="Consolas" w:cs="Consolas" w:eastAsia="Consolas" w:hAnsi="Consolas"/>
-          <w:sz w:val="17"/>
-          <w:szCs w:val="17"/>
-        </w:rPr>
-        <w:t xml:space="preserve">",</w:t>
+        <w:t xml:space="preserve">        "orderGoodsSectionName": "주문상품",</w:t>
       </w:r>
     </w:p>
     <w:p>
@@ -7106,25 +6958,7 @@
           <w:sz w:val="17"/>
           <w:szCs w:val="17"/>
         </w:rPr>
-        <w:t xml:space="preserve">      {"code": "211", "name": "</w:t>
-      </w:r>
-      <w:r>
-        <w:rPr>
-          <w:rFonts w:ascii="Consolas" w:cs="Consolas" w:eastAsia="Consolas" w:hAnsi="Consolas"/>
-          <w:sz w:val="17"/>
-          <w:szCs w:val="17"/>
-          <w:highlight w:val="yellow"/>
-          <w:highlightCs w:val="yellow"/>
-        </w:rPr>
-        <w:t xml:space="preserve">상품 재고부족</w:t>
-      </w:r>
-      <w:r>
-        <w:rPr>
-          <w:rFonts w:ascii="Consolas" w:cs="Consolas" w:eastAsia="Consolas" w:hAnsi="Consolas"/>
-          <w:sz w:val="17"/>
-          <w:szCs w:val="17"/>
-        </w:rPr>
-        <w:t xml:space="preserve">", "isCustomerFault": false},</w:t>
+        <w:t xml:space="preserve">      {"code": "211", "name": "본품 재고부족", "isCustomerFault": false},</w:t>
       </w:r>
     </w:p>
     <w:p>
@@ -7154,157 +6988,67 @@
           <w:sz w:val="17"/>
           <w:szCs w:val="17"/>
         </w:rPr>
-        <w:t xml:space="preserve">      {"code": "219", "name": "</w:t>
-      </w:r>
-      <w:r>
-        <w:rPr>
-          <w:rFonts w:ascii="Consolas" w:cs="Consolas" w:eastAsia="Consolas" w:hAnsi="Consolas"/>
-          <w:sz w:val="17"/>
-          <w:szCs w:val="17"/>
-          <w:highlight w:val="yellow"/>
-          <w:highlightCs w:val="yellow"/>
-        </w:rPr>
-        <w:t xml:space="preserve">주문실수</w:t>
-      </w:r>
-      <w:r>
-        <w:rPr>
-          <w:rFonts w:ascii="Consolas" w:cs="Consolas" w:eastAsia="Consolas" w:hAnsi="Consolas"/>
-          <w:sz w:val="17"/>
-          <w:szCs w:val="17"/>
-        </w:rPr>
-        <w:t xml:space="preserve">", "isCustomerFault": true},</w:t>
-      </w:r>
-    </w:p>
-    <w:p>
-      <w:pPr>
-        <w:shd w:fill="F3F3F3" w:color="auto" w:val="clear"/>
-        <w:spacing w:after="0" w:before="0" w:line="260"/>
-        <w:ind w:left="120" w:right="120"/>
-      </w:pPr>
-      <w:r>
-        <w:rPr>
-          <w:rFonts w:ascii="Consolas" w:cs="Consolas" w:eastAsia="Consolas" w:hAnsi="Consolas"/>
-          <w:sz w:val="17"/>
-          <w:szCs w:val="17"/>
-        </w:rPr>
-        <w:t xml:space="preserve">      {"code": "220", "name": "</w:t>
-      </w:r>
-      <w:r>
-        <w:rPr>
-          <w:rFonts w:ascii="Consolas" w:cs="Consolas" w:eastAsia="Consolas" w:hAnsi="Consolas"/>
-          <w:sz w:val="17"/>
-          <w:szCs w:val="17"/>
-          <w:highlight w:val="yellow"/>
-          <w:highlightCs w:val="yellow"/>
-        </w:rPr>
-        <w:t xml:space="preserve">증정품 재고부족</w:t>
-      </w:r>
-      <w:r>
-        <w:rPr>
-          <w:rFonts w:ascii="Consolas" w:cs="Consolas" w:eastAsia="Consolas" w:hAnsi="Consolas"/>
-          <w:sz w:val="17"/>
-          <w:szCs w:val="17"/>
-        </w:rPr>
-        <w:t xml:space="preserve">", "isCustomerFault": false},</w:t>
-      </w:r>
-    </w:p>
-    <w:p>
-      <w:pPr>
-        <w:shd w:fill="F3F3F3" w:color="auto" w:val="clear"/>
-        <w:spacing w:after="0" w:before="0" w:line="260"/>
-        <w:ind w:left="120" w:right="120"/>
-      </w:pPr>
-      <w:r>
-        <w:rPr>
-          <w:rFonts w:ascii="Consolas" w:cs="Consolas" w:eastAsia="Consolas" w:hAnsi="Consolas"/>
-          <w:sz w:val="17"/>
-          <w:szCs w:val="17"/>
-        </w:rPr>
-        <w:t xml:space="preserve">      {"code": "221", "name": "</w:t>
-      </w:r>
-      <w:r>
-        <w:rPr>
-          <w:rFonts w:ascii="Consolas" w:cs="Consolas" w:eastAsia="Consolas" w:hAnsi="Consolas"/>
-          <w:sz w:val="17"/>
-          <w:szCs w:val="17"/>
-          <w:highlight w:val="yellow"/>
-          <w:highlightCs w:val="yellow"/>
-        </w:rPr>
-        <w:t xml:space="preserve">가격불만</w:t>
-      </w:r>
-      <w:r>
-        <w:rPr>
-          <w:rFonts w:ascii="Consolas" w:cs="Consolas" w:eastAsia="Consolas" w:hAnsi="Consolas"/>
-          <w:sz w:val="17"/>
-          <w:szCs w:val="17"/>
-        </w:rPr>
-        <w:t xml:space="preserve">", "isCustomerFault": true},</w:t>
-      </w:r>
-    </w:p>
-    <w:p>
-      <w:pPr>
-        <w:shd w:fill="F3F3F3" w:color="auto" w:val="clear"/>
-        <w:spacing w:after="0" w:before="0" w:line="260"/>
-        <w:ind w:left="120" w:right="120"/>
-      </w:pPr>
-      <w:r>
-        <w:rPr>
-          <w:rFonts w:ascii="Consolas" w:cs="Consolas" w:eastAsia="Consolas" w:hAnsi="Consolas"/>
-          <w:sz w:val="17"/>
-          <w:szCs w:val="17"/>
-        </w:rPr>
-        <w:t xml:space="preserve">      {"code": "222", "name": "</w:t>
-      </w:r>
-      <w:r>
-        <w:rPr>
-          <w:rFonts w:ascii="Consolas" w:cs="Consolas" w:eastAsia="Consolas" w:hAnsi="Consolas"/>
-          <w:sz w:val="17"/>
-          <w:szCs w:val="17"/>
-          <w:highlight w:val="yellow"/>
-          <w:highlightCs w:val="yellow"/>
-        </w:rPr>
-        <w:t xml:space="preserve">지연지사비용</w:t>
-      </w:r>
-      <w:r>
-        <w:rPr>
-          <w:rFonts w:ascii="Consolas" w:cs="Consolas" w:eastAsia="Consolas" w:hAnsi="Consolas"/>
-          <w:sz w:val="17"/>
-          <w:szCs w:val="17"/>
-        </w:rPr>
-        <w:t xml:space="preserve">", "isCustomerFault": false},</w:t>
-      </w:r>
-    </w:p>
-    <w:p>
-      <w:pPr>
-        <w:shd w:fill="F3F3F3" w:color="auto" w:val="clear"/>
-        <w:spacing w:after="0" w:before="0" w:line="260"/>
-        <w:ind w:left="120" w:right="120"/>
-      </w:pPr>
-      <w:r>
-        <w:rPr>
-          <w:rFonts w:ascii="Consolas" w:cs="Consolas" w:eastAsia="Consolas" w:hAnsi="Consolas"/>
-          <w:sz w:val="17"/>
-          <w:szCs w:val="17"/>
-        </w:rPr>
-        <w:t xml:space="preserve">      {"code": "223", "name": "</w:t>
-      </w:r>
-      <w:r>
-        <w:rPr>
-          <w:rFonts w:ascii="Consolas" w:cs="Consolas" w:eastAsia="Consolas" w:hAnsi="Consolas"/>
-          <w:sz w:val="17"/>
-          <w:szCs w:val="17"/>
-          <w:highlight w:val="yellow"/>
-          <w:highlightCs w:val="yellow"/>
-        </w:rPr>
-        <w:t xml:space="preserve">재결제취소</w:t>
-      </w:r>
-      <w:r>
-        <w:rPr>
-          <w:rFonts w:ascii="Consolas" w:cs="Consolas" w:eastAsia="Consolas" w:hAnsi="Consolas"/>
-          <w:sz w:val="17"/>
-          <w:szCs w:val="17"/>
-        </w:rPr>
-        <w:t xml:space="preserve">", "isCustomerFault": false},</w:t>
+        <w:t xml:space="preserve">      {"code": "219", "name": "주문오류", "isCustomerFault": true},</w:t>
+      </w:r>
+    </w:p>
+    <w:p>
+      <w:pPr>
+        <w:shd w:fill="F3F3F3" w:color="auto" w:val="clear"/>
+        <w:spacing w:after="0" w:before="0" w:line="260"/>
+        <w:ind w:left="120" w:right="120"/>
+      </w:pPr>
+      <w:r>
+        <w:rPr>
+          <w:rFonts w:ascii="Consolas" w:cs="Consolas" w:eastAsia="Consolas" w:hAnsi="Consolas"/>
+          <w:sz w:val="17"/>
+          <w:szCs w:val="17"/>
+        </w:rPr>
+        <w:t xml:space="preserve">      {"code": "220", "name": "증정품 재고부족", "isCustomerFault": false},</w:t>
+      </w:r>
+    </w:p>
+    <w:p>
+      <w:pPr>
+        <w:shd w:fill="F3F3F3" w:color="auto" w:val="clear"/>
+        <w:spacing w:after="0" w:before="0" w:line="260"/>
+        <w:ind w:left="120" w:right="120"/>
+      </w:pPr>
+      <w:r>
+        <w:rPr>
+          <w:rFonts w:ascii="Consolas" w:cs="Consolas" w:eastAsia="Consolas" w:hAnsi="Consolas"/>
+          <w:sz w:val="17"/>
+          <w:szCs w:val="17"/>
+        </w:rPr>
+        <w:t xml:space="preserve">      {"code": "221", "name": "직접입력", "isCustomerFault": true},</w:t>
+      </w:r>
+    </w:p>
+    <w:p>
+      <w:pPr>
+        <w:shd w:fill="F3F3F3" w:color="auto" w:val="clear"/>
+        <w:spacing w:after="0" w:before="0" w:line="260"/>
+        <w:ind w:left="120" w:right="120"/>
+      </w:pPr>
+      <w:r>
+        <w:rPr>
+          <w:rFonts w:ascii="Consolas" w:cs="Consolas" w:eastAsia="Consolas" w:hAnsi="Consolas"/>
+          <w:sz w:val="17"/>
+          <w:szCs w:val="17"/>
+        </w:rPr>
+        <w:t xml:space="preserve">      {"code": "222", "name": "기타자사비용", "isCustomerFault": false},</w:t>
+      </w:r>
+    </w:p>
+    <w:p>
+      <w:pPr>
+        <w:shd w:fill="F3F3F3" w:color="auto" w:val="clear"/>
+        <w:spacing w:after="0" w:before="0" w:line="260"/>
+        <w:ind w:left="120" w:right="120"/>
+      </w:pPr>
+      <w:r>
+        <w:rPr>
+          <w:rFonts w:ascii="Consolas" w:cs="Consolas" w:eastAsia="Consolas" w:hAnsi="Consolas"/>
+          <w:sz w:val="17"/>
+          <w:szCs w:val="17"/>
+        </w:rPr>
+        <w:t xml:space="preserve">      {"code": "223", "name": "미입금취소", "isCustomerFault": false},</w:t>
       </w:r>
     </w:p>
     <w:p>
@@ -7334,25 +7078,7 @@
           <w:sz w:val="17"/>
           <w:szCs w:val="17"/>
         </w:rPr>
-        <w:t xml:space="preserve">      {"code": "</w:t>
-      </w:r>
-      <w:r>
-        <w:rPr>
-          <w:rFonts w:ascii="Consolas" w:cs="Consolas" w:eastAsia="Consolas" w:hAnsi="Consolas"/>
-          <w:sz w:val="17"/>
-          <w:szCs w:val="17"/>
-          <w:highlight w:val="yellow"/>
-          <w:highlightCs w:val="yellow"/>
-        </w:rPr>
-        <w:t xml:space="preserve">400</w:t>
-      </w:r>
-      <w:r>
-        <w:rPr>
-          <w:rFonts w:ascii="Consolas" w:cs="Consolas" w:eastAsia="Consolas" w:hAnsi="Consolas"/>
-          <w:sz w:val="17"/>
-          <w:szCs w:val="17"/>
-        </w:rPr>
-        <w:t xml:space="preserve">", "name": "오늘드림 주문취소", "isCustomerFault": false}</w:t>
+        <w:t xml:space="preserve">      {"code": "600", "name": "오늘드림 주문취소", "isCustomerFault": false}</w:t>
       </w:r>
     </w:p>
     <w:p>
@@ -7517,25 +7243,7 @@
           <w:sz w:val="17"/>
           <w:szCs w:val="17"/>
         </w:rPr>
-        <w:t xml:space="preserve">      {"code": "023", "name": "</w:t>
-      </w:r>
-      <w:r>
-        <w:rPr>
-          <w:rFonts w:ascii="Consolas" w:cs="Consolas" w:eastAsia="Consolas" w:hAnsi="Consolas"/>
-          <w:sz w:val="17"/>
-          <w:szCs w:val="17"/>
-          <w:highlight w:val="yellow"/>
-          <w:highlightCs w:val="yellow"/>
-        </w:rPr>
-        <w:t xml:space="preserve">제일</w:t>
-      </w:r>
-      <w:r>
-        <w:rPr>
-          <w:rFonts w:ascii="Consolas" w:cs="Consolas" w:eastAsia="Consolas" w:hAnsi="Consolas"/>
-          <w:sz w:val="17"/>
-          <w:szCs w:val="17"/>
-        </w:rPr>
-        <w:t xml:space="preserve">"},</w:t>
+        <w:t xml:space="preserve">      {"code": "023", "name": "제일"},</w:t>
       </w:r>
     </w:p>
     <w:p>
@@ -7565,7 +7273,7 @@
           <w:sz w:val="17"/>
           <w:szCs w:val="17"/>
         </w:rPr>
-        <w:t xml:space="preserve">      {"code": "031", "name": "대구"},</w:t>
+        <w:t xml:space="preserve">      {"code": "031", "name": "iM뱅크"},</w:t>
       </w:r>
     </w:p>
     <w:p>
@@ -7821,19 +7529,6 @@
           <w:szCs w:val="17"/>
         </w:rPr>
         <w:t xml:space="preserve">}</w:t>
-      </w:r>
-    </w:p>
-    <w:p>
-      <w:pPr>
-        <w:spacing w:before="240"/>
-      </w:pPr>
-      <w:r>
-        <w:rPr>
-          <w:rFonts w:ascii="맑은 고딕" w:cs="맑은 고딕" w:eastAsia="맑은 고딕" w:hAnsi="맑은 고딕"/>
-          <w:sz w:val="16"/>
-          <w:szCs w:val="16"/>
-        </w:rPr>
-        <w:t xml:space="preserve">※ 노란색 표시: 원본 이미지 해상도가 낮아 판독이 불확실한 값입니다. 원본 정의서와 대조 확인이 필요합니다.</w:t>
       </w:r>
     </w:p>
     <w:sectPr>

</xml_diff>